<commit_message>
added task file 10 to 31
</commit_message>
<xml_diff>
--- a/TASK/03_AWS Challenge_8.docx
+++ b/TASK/03_AWS Challenge_8.docx
@@ -1681,6 +1681,44 @@
         <w:ind w:left="720"/>
       </w:pPr>
       <w:r>
+        <w:lastRenderedPageBreak/>
+        <w:drawing>
+          <wp:inline distT="0" distB="0" distL="0" distR="0" wp14:anchorId="1CD760F4" wp14:editId="247F18EE">
+            <wp:extent cx="5943600" cy="2337435"/>
+            <wp:effectExtent l="0" t="0" r="0" b="5715"/>
+            <wp:docPr id="740096488" name="Picture 1"/>
+            <wp:cNvGraphicFramePr>
+              <a:graphicFrameLocks xmlns:a="http://schemas.openxmlformats.org/drawingml/2006/main" noChangeAspect="1"/>
+            </wp:cNvGraphicFramePr>
+            <a:graphic xmlns:a="http://schemas.openxmlformats.org/drawingml/2006/main">
+              <a:graphicData uri="http://schemas.openxmlformats.org/drawingml/2006/picture">
+                <pic:pic xmlns:pic="http://schemas.openxmlformats.org/drawingml/2006/picture">
+                  <pic:nvPicPr>
+                    <pic:cNvPr id="740096488" name=""/>
+                    <pic:cNvPicPr/>
+                  </pic:nvPicPr>
+                  <pic:blipFill>
+                    <a:blip r:embed="rId28"/>
+                    <a:stretch>
+                      <a:fillRect/>
+                    </a:stretch>
+                  </pic:blipFill>
+                  <pic:spPr>
+                    <a:xfrm>
+                      <a:off x="0" y="0"/>
+                      <a:ext cx="5943600" cy="2337435"/>
+                    </a:xfrm>
+                    <a:prstGeom prst="rect">
+                      <a:avLst/>
+                    </a:prstGeom>
+                  </pic:spPr>
+                </pic:pic>
+              </a:graphicData>
+            </a:graphic>
+          </wp:inline>
+        </w:drawing>
+      </w:r>
+      <w:r>
         <w:rPr>
           <w:noProof/>
         </w:rPr>
@@ -1702,7 +1740,7 @@
                     </pic:cNvPicPr>
                   </pic:nvPicPr>
                   <pic:blipFill>
-                    <a:blip r:embed="rId28">
+                    <a:blip r:embed="rId29">
                       <a:extLst>
                         <a:ext uri="{28A0092B-C50C-407E-A947-70E740481C1C}">
                           <a14:useLocalDpi xmlns:a14="http://schemas.microsoft.com/office/drawing/2010/main" val="0"/>
@@ -1740,14 +1778,7 @@
         <w:ind w:left="1080"/>
       </w:pPr>
       <w:r>
-        <w:lastRenderedPageBreak/>
-        <w:t xml:space="preserve">sudo systemctl </w:t>
-      </w:r>
-      <w:r>
-        <w:t>res</w:t>
-      </w:r>
-      <w:r>
-        <w:t>tart httpd</w:t>
+        <w:t>sudo systemctl restart httpd</w:t>
       </w:r>
     </w:p>
     <w:p>
@@ -1783,7 +1814,7 @@
                     <pic:cNvPicPr/>
                   </pic:nvPicPr>
                   <pic:blipFill>
-                    <a:blip r:embed="rId29"/>
+                    <a:blip r:embed="rId30"/>
                     <a:stretch>
                       <a:fillRect/>
                     </a:stretch>
@@ -1804,6 +1835,91 @@
         </w:drawing>
       </w:r>
     </w:p>
+    <w:p>
+      <w:pPr>
+        <w:ind w:left="720"/>
+      </w:pPr>
+      <w:r>
+        <w:lastRenderedPageBreak/>
+        <w:drawing>
+          <wp:inline distT="0" distB="0" distL="0" distR="0" wp14:anchorId="66353F78" wp14:editId="6E6FE381">
+            <wp:extent cx="5943600" cy="2526030"/>
+            <wp:effectExtent l="0" t="0" r="0" b="7620"/>
+            <wp:docPr id="529985638" name="Picture 1"/>
+            <wp:cNvGraphicFramePr>
+              <a:graphicFrameLocks xmlns:a="http://schemas.openxmlformats.org/drawingml/2006/main" noChangeAspect="1"/>
+            </wp:cNvGraphicFramePr>
+            <a:graphic xmlns:a="http://schemas.openxmlformats.org/drawingml/2006/main">
+              <a:graphicData uri="http://schemas.openxmlformats.org/drawingml/2006/picture">
+                <pic:pic xmlns:pic="http://schemas.openxmlformats.org/drawingml/2006/picture">
+                  <pic:nvPicPr>
+                    <pic:cNvPr id="529985638" name=""/>
+                    <pic:cNvPicPr/>
+                  </pic:nvPicPr>
+                  <pic:blipFill>
+                    <a:blip r:embed="rId31"/>
+                    <a:stretch>
+                      <a:fillRect/>
+                    </a:stretch>
+                  </pic:blipFill>
+                  <pic:spPr>
+                    <a:xfrm>
+                      <a:off x="0" y="0"/>
+                      <a:ext cx="5943600" cy="2526030"/>
+                    </a:xfrm>
+                    <a:prstGeom prst="rect">
+                      <a:avLst/>
+                    </a:prstGeom>
+                  </pic:spPr>
+                </pic:pic>
+              </a:graphicData>
+            </a:graphic>
+          </wp:inline>
+        </w:drawing>
+      </w:r>
+    </w:p>
+    <w:p>
+      <w:pPr>
+        <w:ind w:left="720"/>
+      </w:pPr>
+      <w:r>
+        <w:drawing>
+          <wp:inline distT="0" distB="0" distL="0" distR="0" wp14:anchorId="14F339DC" wp14:editId="26996EA6">
+            <wp:extent cx="5943600" cy="1550670"/>
+            <wp:effectExtent l="0" t="0" r="0" b="0"/>
+            <wp:docPr id="197321321" name="Picture 1"/>
+            <wp:cNvGraphicFramePr>
+              <a:graphicFrameLocks xmlns:a="http://schemas.openxmlformats.org/drawingml/2006/main" noChangeAspect="1"/>
+            </wp:cNvGraphicFramePr>
+            <a:graphic xmlns:a="http://schemas.openxmlformats.org/drawingml/2006/main">
+              <a:graphicData uri="http://schemas.openxmlformats.org/drawingml/2006/picture">
+                <pic:pic xmlns:pic="http://schemas.openxmlformats.org/drawingml/2006/picture">
+                  <pic:nvPicPr>
+                    <pic:cNvPr id="197321321" name=""/>
+                    <pic:cNvPicPr/>
+                  </pic:nvPicPr>
+                  <pic:blipFill>
+                    <a:blip r:embed="rId32"/>
+                    <a:stretch>
+                      <a:fillRect/>
+                    </a:stretch>
+                  </pic:blipFill>
+                  <pic:spPr>
+                    <a:xfrm>
+                      <a:off x="0" y="0"/>
+                      <a:ext cx="5943600" cy="1550670"/>
+                    </a:xfrm>
+                    <a:prstGeom prst="rect">
+                      <a:avLst/>
+                    </a:prstGeom>
+                  </pic:spPr>
+                </pic:pic>
+              </a:graphicData>
+            </a:graphic>
+          </wp:inline>
+        </w:drawing>
+      </w:r>
+    </w:p>
     <w:p/>
     <w:p/>
     <w:p>
@@ -1944,6 +2060,9 @@
     </w:p>
     <w:p>
       <w:r>
+        <w:rPr>
+          <w:noProof/>
+        </w:rPr>
         <w:drawing>
           <wp:inline distT="0" distB="0" distL="0" distR="0" wp14:anchorId="7336D09D" wp14:editId="6446F554">
             <wp:extent cx="5943600" cy="1613535"/>
@@ -1960,7 +2079,7 @@
                     <pic:cNvPicPr/>
                   </pic:nvPicPr>
                   <pic:blipFill>
-                    <a:blip r:embed="rId30"/>
+                    <a:blip r:embed="rId33"/>
                     <a:stretch>
                       <a:fillRect/>
                     </a:stretch>
@@ -1988,20 +2107,15 @@
     </w:p>
     <w:p>
       <w:r>
-        <w:t xml:space="preserve">sudo systemctl </w:t>
-      </w:r>
-      <w:r>
-        <w:t>status</w:t>
-      </w:r>
-      <w:r>
-        <w:t xml:space="preserve"> nginx</w:t>
-      </w:r>
-      <w:r>
-        <w:t xml:space="preserve"> to check the status of whether is active on or of</w:t>
-      </w:r>
-    </w:p>
-    <w:p>
-      <w:r>
+        <w:t>sudo systemctl status nginx to check the status of whether is active on or of</w:t>
+      </w:r>
+    </w:p>
+    <w:p>
+      <w:r>
+        <w:rPr>
+          <w:noProof/>
+        </w:rPr>
+        <w:lastRenderedPageBreak/>
         <w:drawing>
           <wp:inline distT="0" distB="0" distL="0" distR="0" wp14:anchorId="0072F0EB" wp14:editId="17B03854">
             <wp:extent cx="5943600" cy="1442085"/>
@@ -2018,7 +2132,7 @@
                     <pic:cNvPicPr/>
                   </pic:nvPicPr>
                   <pic:blipFill>
-                    <a:blip r:embed="rId31"/>
+                    <a:blip r:embed="rId34"/>
                     <a:stretch>
                       <a:fillRect/>
                     </a:stretch>
@@ -2060,7 +2174,9 @@
     </w:p>
     <w:p>
       <w:r>
-        <w:lastRenderedPageBreak/>
+        <w:rPr>
+          <w:noProof/>
+        </w:rPr>
         <w:drawing>
           <wp:inline distT="0" distB="0" distL="0" distR="0" wp14:anchorId="30ED4A2C" wp14:editId="024B868C">
             <wp:extent cx="5943600" cy="2111375"/>
@@ -2077,7 +2193,7 @@
                     <pic:cNvPicPr/>
                   </pic:nvPicPr>
                   <pic:blipFill>
-                    <a:blip r:embed="rId32"/>
+                    <a:blip r:embed="rId35"/>
                     <a:stretch>
                       <a:fillRect/>
                     </a:stretch>
@@ -2110,6 +2226,9 @@
     </w:p>
     <w:p>
       <w:r>
+        <w:rPr>
+          <w:noProof/>
+        </w:rPr>
         <w:drawing>
           <wp:inline distT="0" distB="0" distL="0" distR="0" wp14:anchorId="2F5C59B5" wp14:editId="04EA4AB3">
             <wp:extent cx="4275190" cy="2110923"/>
@@ -2126,7 +2245,7 @@
                     <pic:cNvPicPr/>
                   </pic:nvPicPr>
                   <pic:blipFill>
-                    <a:blip r:embed="rId33"/>
+                    <a:blip r:embed="rId36"/>
                     <a:stretch>
                       <a:fillRect/>
                     </a:stretch>
@@ -2154,6 +2273,10 @@
     </w:p>
     <w:p>
       <w:r>
+        <w:rPr>
+          <w:noProof/>
+        </w:rPr>
+        <w:lastRenderedPageBreak/>
         <w:drawing>
           <wp:inline distT="0" distB="0" distL="0" distR="0" wp14:anchorId="6FFCDF5C" wp14:editId="52295103">
             <wp:extent cx="5943600" cy="1529080"/>
@@ -2170,7 +2293,7 @@
                     <pic:cNvPicPr/>
                   </pic:nvPicPr>
                   <pic:blipFill>
-                    <a:blip r:embed="rId34"/>
+                    <a:blip r:embed="rId37"/>
                     <a:stretch>
                       <a:fillRect/>
                     </a:stretch>
@@ -2217,7 +2340,9 @@
     </w:p>
     <w:p>
       <w:r>
-        <w:lastRenderedPageBreak/>
+        <w:rPr>
+          <w:noProof/>
+        </w:rPr>
         <w:drawing>
           <wp:inline distT="0" distB="0" distL="0" distR="0" wp14:anchorId="3111B77B" wp14:editId="0EF7A083">
             <wp:extent cx="5943600" cy="1266825"/>
@@ -2234,7 +2359,7 @@
                     <pic:cNvPicPr/>
                   </pic:nvPicPr>
                   <pic:blipFill>
-                    <a:blip r:embed="rId35"/>
+                    <a:blip r:embed="rId38"/>
                     <a:stretch>
                       <a:fillRect/>
                     </a:stretch>
@@ -2256,7 +2381,7 @@
       </w:r>
     </w:p>
     <w:p>
-      <w:hyperlink r:id="rId36" w:history="1">
+      <w:hyperlink r:id="rId39" w:history="1">
         <w:r>
           <w:rPr>
             <w:rStyle w:val="Hyperlink"/>
@@ -2273,6 +2398,9 @@
     </w:p>
     <w:p>
       <w:r>
+        <w:rPr>
+          <w:noProof/>
+        </w:rPr>
         <w:drawing>
           <wp:inline distT="0" distB="0" distL="0" distR="0" wp14:anchorId="79171986" wp14:editId="54879E7F">
             <wp:extent cx="5943600" cy="2110740"/>
@@ -2289,7 +2417,7 @@
                     <pic:cNvPicPr/>
                   </pic:nvPicPr>
                   <pic:blipFill>
-                    <a:blip r:embed="rId37"/>
+                    <a:blip r:embed="rId40"/>
                     <a:stretch>
                       <a:fillRect/>
                     </a:stretch>
@@ -2351,6 +2479,10 @@
     </w:p>
     <w:p>
       <w:r>
+        <w:rPr>
+          <w:noProof/>
+        </w:rPr>
+        <w:lastRenderedPageBreak/>
         <w:drawing>
           <wp:inline distT="0" distB="0" distL="0" distR="0" wp14:anchorId="42C03268" wp14:editId="651C792D">
             <wp:extent cx="5943600" cy="1834515"/>
@@ -2367,7 +2499,7 @@
                     <pic:cNvPicPr/>
                   </pic:nvPicPr>
                   <pic:blipFill>
-                    <a:blip r:embed="rId38"/>
+                    <a:blip r:embed="rId41"/>
                     <a:stretch>
                       <a:fillRect/>
                     </a:stretch>
@@ -2405,7 +2537,9 @@
     </w:p>
     <w:p>
       <w:r>
-        <w:lastRenderedPageBreak/>
+        <w:rPr>
+          <w:noProof/>
+        </w:rPr>
         <w:drawing>
           <wp:inline distT="0" distB="0" distL="0" distR="0" wp14:anchorId="22D2D1F2" wp14:editId="22E09725">
             <wp:extent cx="5943600" cy="1834515"/>
@@ -2422,7 +2556,7 @@
                     <pic:cNvPicPr/>
                   </pic:nvPicPr>
                   <pic:blipFill>
-                    <a:blip r:embed="rId38"/>
+                    <a:blip r:embed="rId41"/>
                     <a:stretch>
                       <a:fillRect/>
                     </a:stretch>
@@ -2465,6 +2599,9 @@
     </w:p>
     <w:p>
       <w:r>
+        <w:rPr>
+          <w:noProof/>
+        </w:rPr>
         <w:drawing>
           <wp:inline distT="0" distB="0" distL="0" distR="0" wp14:anchorId="338B0845" wp14:editId="1DAF8E69">
             <wp:extent cx="5943600" cy="2769235"/>
@@ -2481,7 +2618,7 @@
                     <pic:cNvPicPr/>
                   </pic:nvPicPr>
                   <pic:blipFill>
-                    <a:blip r:embed="rId39"/>
+                    <a:blip r:embed="rId42"/>
                     <a:stretch>
                       <a:fillRect/>
                     </a:stretch>
@@ -2519,6 +2656,7 @@
     </w:p>
     <w:p>
       <w:r>
+        <w:lastRenderedPageBreak/>
         <w:t>Go to the bin folder, which is in the Apache folder (Type: </w:t>
       </w:r>
       <w:r>
@@ -2534,6 +2672,9 @@
     </w:p>
     <w:p>
       <w:r>
+        <w:rPr>
+          <w:noProof/>
+        </w:rPr>
         <w:drawing>
           <wp:inline distT="0" distB="0" distL="0" distR="0" wp14:anchorId="36C5FE9F" wp14:editId="67890504">
             <wp:extent cx="5943600" cy="1854835"/>
@@ -2550,7 +2691,7 @@
                     <pic:cNvPicPr/>
                   </pic:nvPicPr>
                   <pic:blipFill>
-                    <a:blip r:embed="rId40"/>
+                    <a:blip r:embed="rId43"/>
                     <a:stretch>
                       <a:fillRect/>
                     </a:stretch>
@@ -2573,7 +2714,6 @@
     </w:p>
     <w:p>
       <w:r>
-        <w:lastRenderedPageBreak/>
         <w:t> Now type </w:t>
       </w:r>
       <w:r>
@@ -2594,6 +2734,9 @@
     </w:p>
     <w:p>
       <w:r>
+        <w:rPr>
+          <w:noProof/>
+        </w:rPr>
         <w:drawing>
           <wp:inline distT="0" distB="0" distL="0" distR="0" wp14:anchorId="75E459BD" wp14:editId="7047B082">
             <wp:extent cx="5943600" cy="1374140"/>
@@ -2610,7 +2753,7 @@
                     <pic:cNvPicPr/>
                   </pic:nvPicPr>
                   <pic:blipFill>
-                    <a:blip r:embed="rId41"/>
+                    <a:blip r:embed="rId44"/>
                     <a:stretch>
                       <a:fillRect/>
                     </a:stretch>
@@ -2660,7 +2803,7 @@
                     </pic:cNvPicPr>
                   </pic:nvPicPr>
                   <pic:blipFill>
-                    <a:blip r:embed="rId42">
+                    <a:blip r:embed="rId45">
                       <a:extLst>
                         <a:ext uri="{28A0092B-C50C-407E-A947-70E740481C1C}">
                           <a14:useLocalDpi xmlns:a14="http://schemas.microsoft.com/office/drawing/2010/main" val="0"/>
@@ -2714,6 +2857,7 @@
     </w:p>
     <w:p>
       <w:r>
+        <w:lastRenderedPageBreak/>
         <w:t xml:space="preserve">Go to </w:t>
       </w:r>
       <w:r>
@@ -2797,7 +2941,6 @@
     </w:p>
     <w:p>
       <w:r>
-        <w:lastRenderedPageBreak/>
         <w:t xml:space="preserve"> apache-tomcat-11.0.11</w:t>
       </w:r>
       <w:r>
@@ -2815,6 +2958,9 @@
     </w:p>
     <w:p>
       <w:r>
+        <w:rPr>
+          <w:noProof/>
+        </w:rPr>
         <w:drawing>
           <wp:inline distT="0" distB="0" distL="0" distR="0" wp14:anchorId="553275D3" wp14:editId="53C15F4D">
             <wp:extent cx="5943600" cy="1374140"/>
@@ -2831,7 +2977,7 @@
                     <pic:cNvPicPr/>
                   </pic:nvPicPr>
                   <pic:blipFill>
-                    <a:blip r:embed="rId41"/>
+                    <a:blip r:embed="rId44"/>
                     <a:stretch>
                       <a:fillRect/>
                     </a:stretch>
@@ -2869,6 +3015,9 @@
     </w:p>
     <w:p>
       <w:r>
+        <w:rPr>
+          <w:noProof/>
+        </w:rPr>
         <w:drawing>
           <wp:inline distT="0" distB="0" distL="0" distR="0" wp14:anchorId="229536A7" wp14:editId="627B4055">
             <wp:extent cx="5943600" cy="1254125"/>
@@ -2885,7 +3034,7 @@
                     <pic:cNvPicPr/>
                   </pic:nvPicPr>
                   <pic:blipFill>
-                    <a:blip r:embed="rId43"/>
+                    <a:blip r:embed="rId46"/>
                     <a:stretch>
                       <a:fillRect/>
                     </a:stretch>
@@ -2913,6 +3062,9 @@
     </w:p>
     <w:p>
       <w:r>
+        <w:rPr>
+          <w:noProof/>
+        </w:rPr>
         <w:drawing>
           <wp:inline distT="0" distB="0" distL="0" distR="0" wp14:anchorId="3A87AC83" wp14:editId="05EFCD3A">
             <wp:extent cx="5943600" cy="1254125"/>
@@ -2929,7 +3081,7 @@
                     <pic:cNvPicPr/>
                   </pic:nvPicPr>
                   <pic:blipFill>
-                    <a:blip r:embed="rId43"/>
+                    <a:blip r:embed="rId46"/>
                     <a:stretch>
                       <a:fillRect/>
                     </a:stretch>
@@ -2952,6 +3104,10 @@
     </w:p>
     <w:p>
       <w:r>
+        <w:rPr>
+          <w:noProof/>
+        </w:rPr>
+        <w:lastRenderedPageBreak/>
         <w:drawing>
           <wp:inline distT="0" distB="0" distL="0" distR="0" wp14:anchorId="56EB00A0" wp14:editId="2E3D53F8">
             <wp:extent cx="5943600" cy="2279015"/>
@@ -2968,7 +3124,7 @@
                     <pic:cNvPicPr/>
                   </pic:nvPicPr>
                   <pic:blipFill>
-                    <a:blip r:embed="rId44"/>
+                    <a:blip r:embed="rId47"/>
                     <a:stretch>
                       <a:fillRect/>
                     </a:stretch>
@@ -2994,7 +3150,6 @@
         <w:rPr>
           <w:rFonts w:ascii="Segoe UI Emoji" w:hAnsi="Segoe UI Emoji" w:cs="Segoe UI Emoji"/>
         </w:rPr>
-        <w:lastRenderedPageBreak/>
         <w:t>✅</w:t>
       </w:r>
       <w:r>
@@ -5114,6 +5269,7 @@
   <w:style w:type="character" w:default="1" w:styleId="DefaultParagraphFont">
     <w:name w:val="Default Paragraph Font"/>
     <w:uiPriority w:val="1"/>
+    <w:semiHidden/>
     <w:unhideWhenUsed/>
   </w:style>
   <w:style w:type="table" w:default="1" w:styleId="TableNormal">

</xml_diff>